<commit_message>
Prepare launch review branch for PR
</commit_message>
<xml_diff>
--- a/public/templates/fuck-journal-word-template-zh.docx
+++ b/public/templates/fuck-journal-word-template-zh.docx
@@ -231,7 +231,7 @@
         </ns0:rPr>
       </ns0:pPr>
       <ns0:r>
-        <ns0:t>普遍性与复杂性研究</ns0:t>
+        <ns0:t>不确定性与复杂性研究</ns0:t>
       </ns0:r>
       <ns0:r>
         <ns0:rPr>
@@ -533,7 +533,7 @@
           <ns0:sz ns0:val="21"/>
           <ns0:szCs ns0:val="21"/>
         </ns0:rPr>
-        <ns0:t>普遍性；复杂性；系统；知识（3-8个）</ns0:t>
+        <ns0:t>不确定性；复杂性；系统；知识（3-8个）</ns0:t>
       </ns0:r>
     </ns0:p>
     <ns0:p ns2:paraId="76A6F51F">

</xml_diff>